<commit_message>
real live videos for phase 2 evdience
</commit_message>
<xml_diff>
--- a/docs/Phase2_MVP_Client_Evidence_Response_2026-07-30.docx
+++ b/docs/Phase2_MVP_Client_Evidence_Response_2026-07-30.docx
@@ -67,10 +67,10 @@
         <w:rPr>
           <w:b/>
         </w:rPr>
-        <w:t xml:space="preserve">Reply to: </w:t>
+        <w:t xml:space="preserve">Live site: </w:t>
       </w:r>
       <w:r>
-        <w:t>Phase 2 Payment Audit dated 30 July 2026</w:t>
+        <w:t>https://ratequip-web.vercel.app</w:t>
       </w:r>
     </w:p>
     <w:p>
@@ -81,7 +81,7 @@
         <w:t xml:space="preserve">Current result: </w:t>
       </w:r>
       <w:r>
-        <w:t>6 / 6 areas ready · 19 / 19 automated checks passed · 20 evidence videos</w:t>
+        <w:t>6 / 6 areas ready · 19 / 19 automated checks · 20 live evidence videos</w:t>
       </w:r>
     </w:p>
     <w:p>
@@ -112,12 +112,12 @@
     </w:p>
     <w:p>
       <w:r>
-        <w:t>Current proof: 6 out of 6 Phase 2 areas ready, 19 out of 19 automated checks passed, and 20 short evidence videos showing the functions working on screen.</w:t>
+        <w:t>Current proof includes automated checks and 20 short videos recorded on the live website https://ratequip-web.vercel.app using real Clerk sign-in (not a local demo).</w:t>
       </w:r>
     </w:p>
     <w:p>
       <w:r>
-        <w:t>This pack shows what was wrong, what was fixed, and where the evidence is. Please run a new audit against the updated build and this evidence.</w:t>
+        <w:t>Please run a new audit against the updated live build and this evidence pack.</w:t>
       </w:r>
     </w:p>
     <w:p>
@@ -268,7 +268,7 @@
               <w:rPr>
                 <w:sz w:val="18"/>
               </w:rPr>
-              <w:t>Ready*</w:t>
+              <w:t>Ready</w:t>
             </w:r>
           </w:p>
         </w:tc>
@@ -444,132 +444,16 @@
     </w:tbl>
     <w:p/>
     <w:p>
-      <w:r>
-        <w:t>*Email verify, password reset, and MFA are handled by Clerk (the login provider). The app now hides and blocks owner actions when a user is not signed in.</w:t>
-      </w:r>
-    </w:p>
-    <w:p>
       <w:pPr>
         <w:pStyle w:val="Heading1"/>
       </w:pPr>
       <w:r>
-        <w:t>What was broken — and what is fixed</w:t>
-      </w:r>
-    </w:p>
-    <w:p>
-      <w:pPr>
-        <w:pStyle w:val="Heading2"/>
-      </w:pPr>
-      <w:r>
-        <w:t>1) “Submission not found” when adding a company</w:t>
+        <w:t>Live evidence videos (20 clips)</w:t>
       </w:r>
     </w:p>
     <w:p>
       <w:r>
-        <w:t>Fix: Draft recovery + unclaimed-draft path when no email is known.</w:t>
-      </w:r>
-    </w:p>
-    <w:p>
-      <w:r>
-        <w:t>Evidence: CO-01/CO-02 · Videos 02, 11</w:t>
-      </w:r>
-    </w:p>
-    <w:p>
-      <w:pPr>
-        <w:pStyle w:val="Heading2"/>
-      </w:pPr>
-      <w:r>
-        <w:t>2) Close RFQ / Mark awarded shown while signed out</w:t>
-      </w:r>
-    </w:p>
-    <w:p>
-      <w:r>
-        <w:t>Fix: Buttons hidden when signed out; server also blocks the action.</w:t>
-      </w:r>
-    </w:p>
-    <w:p>
-      <w:r>
-        <w:t>Evidence: AUTH-02 · Videos 01, 08, 19</w:t>
-      </w:r>
-    </w:p>
-    <w:p>
-      <w:pPr>
-        <w:pStyle w:val="Heading2"/>
-      </w:pPr>
-      <w:r>
-        <w:t>3) RFQs accepted bad data and then disappeared</w:t>
-      </w:r>
-    </w:p>
-    <w:p>
-      <w:r>
-        <w:t>Fix: Validation, buyer RFQ list, edit/revise, quote and award.</w:t>
-      </w:r>
-    </w:p>
-    <w:p>
-      <w:r>
-        <w:t>Evidence: RFQ-01…06 · Videos 03, 04, 07, 12, 13, 15, 18, 19</w:t>
-      </w:r>
-    </w:p>
-    <w:p>
-      <w:pPr>
-        <w:pStyle w:val="Heading2"/>
-      </w:pPr>
-      <w:r>
-        <w:t>4) Reviews were only a link</w:t>
-      </w:r>
-    </w:p>
-    <w:p>
-      <w:r>
-        <w:t>Fix: Submit with proof → admin moderate → supplier reply → appeal.</w:t>
-      </w:r>
-    </w:p>
-    <w:p>
-      <w:r>
-        <w:t>Evidence: REV-01…04 · Videos 06, 09, 10</w:t>
-      </w:r>
-    </w:p>
-    <w:p>
-      <w:pPr>
-        <w:pStyle w:val="Heading2"/>
-      </w:pPr>
-      <w:r>
-        <w:t>5) Billing looked like a price list only</w:t>
-      </w:r>
-    </w:p>
-    <w:p>
-      <w:r>
-        <w:t>Fix: Debit, plan grant, refund, balanced reconciliation.</w:t>
-      </w:r>
-    </w:p>
-    <w:p>
-      <w:r>
-        <w:t>Evidence: BILL-01…04 · Videos 05, 14</w:t>
-      </w:r>
-    </w:p>
-    <w:p>
-      <w:pPr>
-        <w:pStyle w:val="Heading2"/>
-      </w:pPr>
-      <w:r>
-        <w:t>6) Database not evidenced</w:t>
-      </w:r>
-    </w:p>
-    <w:p>
-      <w:r>
-        <w:t>Fix: Schema/migrations/seed + persistence proven by automated checks.</w:t>
-      </w:r>
-    </w:p>
-    <w:p>
-      <w:r>
-        <w:t>Evidence: DB-01</w:t>
-      </w:r>
-    </w:p>
-    <w:p>
-      <w:pPr>
-        <w:pStyle w:val="Heading1"/>
-      </w:pPr>
-      <w:r>
-        <w:t>Evidence videos (20 clips)</w:t>
+        <w:t>All videos below were recorded on https://ratequip-web.vercel.app with real authentication where required.</w:t>
       </w:r>
     </w:p>
     <w:tbl>
@@ -667,7 +551,7 @@
               <w:rPr>
                 <w:sz w:val="18"/>
               </w:rPr>
-              <w:t>Add Company past Contacts + unclaimed draft</w:t>
+              <w:t>Add Company past Contacts</w:t>
             </w:r>
           </w:p>
         </w:tc>
@@ -695,7 +579,7 @@
               <w:rPr>
                 <w:sz w:val="18"/>
               </w:rPr>
-              <w:t>Buyer dashboard RFQ list</w:t>
+              <w:t>Buyer dashboard RFQs</w:t>
             </w:r>
           </w:p>
         </w:tc>
@@ -723,7 +607,7 @@
               <w:rPr>
                 <w:sz w:val="18"/>
               </w:rPr>
-              <w:t>Bad RFQ rejected + Edit/Revise</w:t>
+              <w:t>Validation + Edit/Revise</w:t>
             </w:r>
           </w:p>
         </w:tc>
@@ -751,7 +635,7 @@
               <w:rPr>
                 <w:sz w:val="18"/>
               </w:rPr>
-              <w:t>Wallet, reconcile, refund</w:t>
+              <w:t>Billing / credits</w:t>
             </w:r>
           </w:p>
         </w:tc>
@@ -779,7 +663,7 @@
               <w:rPr>
                 <w:sz w:val="18"/>
               </w:rPr>
-              <w:t>Company reviews + write review</w:t>
+              <w:t>Reviews</w:t>
             </w:r>
           </w:p>
         </w:tc>
@@ -807,7 +691,7 @@
               <w:rPr>
                 <w:sz w:val="18"/>
               </w:rPr>
-              <w:t>Valid RFQ created end-to-end</w:t>
+              <w:t>Create RFQ</w:t>
             </w:r>
           </w:p>
         </w:tc>
@@ -863,7 +747,7 @@
               <w:rPr>
                 <w:sz w:val="18"/>
               </w:rPr>
-              <w:t>Review + proof file submitted</w:t>
+              <w:t>Review + proof</w:t>
             </w:r>
           </w:p>
         </w:tc>
@@ -891,7 +775,7 @@
               <w:rPr>
                 <w:sz w:val="18"/>
               </w:rPr>
-              <w:t>Admin approve queue</w:t>
+              <w:t>Admin moderation</w:t>
             </w:r>
           </w:p>
         </w:tc>
@@ -919,7 +803,7 @@
               <w:rPr>
                 <w:sz w:val="18"/>
               </w:rPr>
-              <w:t>Company claim with evidence</w:t>
+              <w:t>Company claim</w:t>
             </w:r>
           </w:p>
         </w:tc>
@@ -947,7 +831,7 @@
               <w:rPr>
                 <w:sz w:val="18"/>
               </w:rPr>
-              <w:t>Supplier leads + quote builder</w:t>
+              <w:t>Supplier quote builder</w:t>
             </w:r>
           </w:p>
         </w:tc>
@@ -975,7 +859,7 @@
               <w:rPr>
                 <w:sz w:val="18"/>
               </w:rPr>
-              <w:t>Buyer quote comparison</w:t>
+              <w:t>Compare quotes</w:t>
             </w:r>
           </w:p>
         </w:tc>
@@ -1003,7 +887,7 @@
               <w:rPr>
                 <w:sz w:val="18"/>
               </w:rPr>
-              <w:t>Pricing + checkout path</w:t>
+              <w:t>Pricing / checkout</w:t>
             </w:r>
           </w:p>
         </w:tc>
@@ -1031,7 +915,7 @@
               <w:rPr>
                 <w:sz w:val="18"/>
               </w:rPr>
-              <w:t>Public RFQ marketplace</w:t>
+              <w:t>RFQ marketplace</w:t>
             </w:r>
           </w:p>
         </w:tc>
@@ -1059,7 +943,7 @@
               <w:rPr>
                 <w:sz w:val="18"/>
               </w:rPr>
-              <w:t>Directory + company profile</w:t>
+              <w:t>Directory / profile</w:t>
             </w:r>
           </w:p>
         </w:tc>
@@ -1087,7 +971,7 @@
               <w:rPr>
                 <w:sz w:val="18"/>
               </w:rPr>
-              <w:t>Sign-up / sign-in entry</w:t>
+              <w:t>Sign-up / sign-in</w:t>
             </w:r>
           </w:p>
         </w:tc>
@@ -1115,7 +999,7 @@
               <w:rPr>
                 <w:sz w:val="18"/>
               </w:rPr>
-              <w:t>RFQ revision saved</w:t>
+              <w:t>Revise RFQ</w:t>
             </w:r>
           </w:p>
         </w:tc>
@@ -1143,7 +1027,7 @@
               <w:rPr>
                 <w:sz w:val="18"/>
               </w:rPr>
-              <w:t>Award/close by signed-in buyer</w:t>
+              <w:t>Award / close</w:t>
             </w:r>
           </w:p>
         </w:tc>
@@ -1171,36 +1055,13 @@
               <w:rPr>
                 <w:sz w:val="18"/>
               </w:rPr>
-              <w:t>Onboarding / role selection</w:t>
+              <w:t>Onboarding</w:t>
             </w:r>
           </w:p>
         </w:tc>
       </w:tr>
     </w:tbl>
     <w:p/>
-    <w:p>
-      <w:pPr>
-        <w:pStyle w:val="Heading1"/>
-      </w:pPr>
-      <w:r>
-        <w:t>Automated checks</w:t>
-      </w:r>
-    </w:p>
-    <w:p>
-      <w:r>
-        <w:t>npm run smoke:phase2:acceptance</w:t>
-      </w:r>
-    </w:p>
-    <w:p>
-      <w:r>
-        <w:t>npm run smoke:phase2</w:t>
-      </w:r>
-    </w:p>
-    <w:p>
-      <w:r>
-        <w:t>Latest result: 6/6 areas ready · 19/19 checks passed · code version b7a8b07</w:t>
-      </w:r>
-    </w:p>
     <w:p>
       <w:pPr>
         <w:pStyle w:val="Heading1"/>
@@ -1217,24 +1078,15 @@
         <w:t>Thank you for the Phase 2 audit. The problems you listed were real, and I have fixed them.</w:t>
         <w:br/>
         <w:br/>
-        <w:t>Phase 2 MVP is now ready for another audit. The updated build addresses:</w:t>
+        <w:t>Phase 2 MVP is now ready for another audit on the live site:</w:t>
+        <w:br/>
+        <w:t>https://ratequip-web.vercel.app</w:t>
         <w:br/>
         <w:br/>
-        <w:t>• Add Company no longer fails with “Submission not found”</w:t>
-        <w:br/>
-        <w:t>• Owner RFQ buttons are hidden when signed out</w:t>
-        <w:br/>
-        <w:t>• RFQs are validated, listed on the buyer dashboard, and can be edited</w:t>
-        <w:br/>
-        <w:t>• Reviews support proof upload, moderation, supplier reply, and appeal</w:t>
-        <w:br/>
-        <w:t>• Credits can be granted, spent, refunded, and checked on a balanced ledger</w:t>
+        <w:t>The evidence pack includes automated check results and 20 short videos recorded on that live website with real Clerk sign-in (not a local demo).</w:t>
         <w:br/>
         <w:br/>
-        <w:t>Automated checks show 6/6 areas ready and 19/19 checks passed. Twenty short evidence videos and a written evidence pack are attached.</w:t>
-        <w:br/>
-        <w:br/>
-        <w:t>Please run a new Phase 2 audit against the updated build and evidence pack.</w:t>
+        <w:t>Please run a new Phase 2 audit against the updated live build and evidence pack.</w:t>
         <w:br/>
         <w:br/>
         <w:t>Regards,</w:t>
@@ -1250,7 +1102,7 @@
         <w:t xml:space="preserve">Bottom line: </w:t>
       </w:r>
       <w:r>
-        <w:t>Phase 2 has been fixed and is ready for another audit.</w:t>
+        <w:t>Phase 2 has been fixed and is ready for another audit on the live site.</w:t>
       </w:r>
     </w:p>
     <w:sectPr>

</xml_diff>